<commit_message>
Simplify Rahul guide: drop software-center search step
Windows Cisco VPN worked before, so remove Intune/SCCM/share
lookup and start from downloading or reusing the Cisco MSI.

Co-authored-by: bettydes-hub <bettydes-hub@users.noreply.github.com>
</commit_message>
<xml_diff>
--- a/docs/Rahul-Cisco-Secure-Client-Delivery-Guide.docx
+++ b/docs/Rahul-Cisco-Secure-Client-Delivery-Guide.docx
@@ -12,47 +12,50 @@
     </w:p>
     <w:p>
       <w:r>
-        <w:rPr>
-          <w:b w:val="0"/>
-          <w:sz w:val="22"/>
-        </w:rPr>
         <w:t>Purpose: Provide the Windows VPN installer so a PC user can connect to the company VPN the same way the phone already does with Cisco AnyConnect.</w:t>
       </w:r>
     </w:p>
     <w:p>
       <w:r>
         <w:rPr>
-          <w:b w:val="0"/>
-          <w:sz w:val="22"/>
+          <w:b/>
         </w:rPr>
-        <w:t>VPN server: firewall.imagingak.com</w:t>
+        <w:t xml:space="preserve">Context: </w:t>
+      </w:r>
+      <w:r>
+        <w:t>Cisco VPN already worked on Windows before. We do not need to search software share / Intune / SCCM. Just download (or reuse) the Cisco Windows client and send it.</w:t>
       </w:r>
     </w:p>
     <w:p>
       <w:r>
         <w:rPr>
-          <w:b w:val="0"/>
+          <w:b/>
+        </w:rPr>
+        <w:t xml:space="preserve">VPN server: </w:t>
+      </w:r>
+      <w:r>
+        <w:t>firewall.imagingak.com</w:t>
+      </w:r>
+    </w:p>
+    <w:p>
+      <w:r>
+        <w:rPr>
+          <w:b/>
         </w:rPr>
         <w:t xml:space="preserve">Preferred connection URL: </w:t>
       </w:r>
       <w:r>
-        <w:rPr>
-          <w:b/>
-        </w:rPr>
         <w:t>firewall.imagingak.com/wimr1507</w:t>
       </w:r>
     </w:p>
     <w:p>
       <w:r>
         <w:rPr>
-          <w:b w:val="0"/>
+          <w:b/>
         </w:rPr>
         <w:t xml:space="preserve">Client to send: </w:t>
       </w:r>
       <w:r>
-        <w:rPr>
-          <w:b/>
-        </w:rPr>
         <w:t>Cisco Secure Client (includes AnyConnect VPN) for Windows</w:t>
       </w:r>
     </w:p>
@@ -66,10 +69,6 @@
     </w:p>
     <w:p>
       <w:r>
-        <w:rPr>
-          <w:b w:val="0"/>
-          <w:sz w:val="22"/>
-        </w:rPr>
         <w:t>Send one Windows installer package for Cisco Secure Client / AnyConnect VPN.</w:t>
       </w:r>
     </w:p>
@@ -144,7 +143,7 @@
           </w:tcPr>
           <w:p>
             <w:r>
-              <w:t>IT-approved full Secure Client predeploy package (if that is the company standard)</w:t>
+              <w:t>The same Cisco Windows VPN installer used previously when Windows VPN worked</w:t>
             </w:r>
           </w:p>
         </w:tc>
@@ -155,7 +154,6 @@
       <w:r>
         <w:rPr>
           <w:b/>
-          <w:sz w:val="22"/>
         </w:rPr>
         <w:t>Do not send:</w:t>
       </w:r>
@@ -181,7 +179,7 @@
         <w:pStyle w:val="ListBullet"/>
       </w:pPr>
       <w:r>
-        <w:t>Extra modules (Umbrella, AMP, ISE, NAM) unless your standard company package includes them on purpose</w:t>
+        <w:t>Extra modules (Umbrella, AMP, ISE, NAM) unless that is intentionally your standard package</w:t>
       </w:r>
     </w:p>
     <w:p>
@@ -189,63 +187,7 @@
         <w:pStyle w:val="Heading1"/>
       </w:pPr>
       <w:r>
-        <w:t>Step 1 — Prefer an existing company copy</w:t>
-      </w:r>
-    </w:p>
-    <w:p>
-      <w:pPr>
-        <w:pStyle w:val="ListNumber"/>
-      </w:pPr>
-      <w:r>
-        <w:t>Check whether Imaging Associates already has an approved Windows VPN client package in:</w:t>
-      </w:r>
-    </w:p>
-    <w:p>
-      <w:pPr>
-        <w:pStyle w:val="ListBullet"/>
-      </w:pPr>
-      <w:r>
-        <w:t>software share / software center</w:t>
-      </w:r>
-    </w:p>
-    <w:p>
-      <w:pPr>
-        <w:pStyle w:val="ListBullet"/>
-      </w:pPr>
-      <w:r>
-        <w:t>Intune / SCCM / endpoint management</w:t>
-      </w:r>
-    </w:p>
-    <w:p>
-      <w:pPr>
-        <w:pStyle w:val="ListBullet"/>
-      </w:pPr>
-      <w:r>
-        <w:t>previous IT VPN deployment files</w:t>
-      </w:r>
-    </w:p>
-    <w:p>
-      <w:pPr>
-        <w:pStyle w:val="ListNumber"/>
-      </w:pPr>
-      <w:r>
-        <w:t>If you find an approved Cisco Secure Client or AnyConnect Windows installer, skip to Step 3 (how to send it).</w:t>
-      </w:r>
-    </w:p>
-    <w:p>
-      <w:pPr>
-        <w:pStyle w:val="ListNumber"/>
-      </w:pPr>
-      <w:r>
-        <w:t>If you do not have one, continue to Step 2.</w:t>
-      </w:r>
-    </w:p>
-    <w:p>
-      <w:pPr>
-        <w:pStyle w:val="Heading1"/>
-      </w:pPr>
-      <w:r>
-        <w:t>Step 2 — Download from Cisco (if no local package)</w:t>
+        <w:t>Step 1 — Download the Cisco Windows client</w:t>
       </w:r>
     </w:p>
     <w:p>
@@ -258,10 +200,6 @@
     </w:p>
     <w:p>
       <w:r>
-        <w:rPr>
-          <w:b w:val="0"/>
-          <w:sz w:val="22"/>
-        </w:rPr>
         <w:t>Use a Cisco.com account tied to the company contract/license.</w:t>
       </w:r>
     </w:p>
@@ -331,18 +269,13 @@
     </w:p>
     <w:p>
       <w:r>
-        <w:rPr>
-          <w:b w:val="0"/>
-          <w:sz w:val="22"/>
-        </w:rPr>
-        <w:t>If Cisco.com blocks the download: the account may lack entitlement. Use an account that owns the AnyConnect/Secure Client license, or use your existing internal package from Step 1.</w:t>
+        <w:t>If Cisco.com blocks the download: the account may lack entitlement. Use an account that owns the AnyConnect/Secure Client license, or reuse the previous Windows Cisco VPN installer if you still have that file.</w:t>
       </w:r>
     </w:p>
     <w:p>
       <w:r>
         <w:rPr>
           <w:b/>
-          <w:sz w:val="22"/>
         </w:rPr>
         <w:t>Optional alternate source — VPN web portal (if enabled):</w:t>
       </w:r>
@@ -376,7 +309,7 @@
         <w:pStyle w:val="ListNumber"/>
       </w:pPr>
       <w:r>
-        <w:t>Download that package and continue to Step 3</w:t>
+        <w:t>Download that package and continue to Step 2</w:t>
       </w:r>
     </w:p>
     <w:p>
@@ -384,15 +317,11 @@
         <w:pStyle w:val="Heading1"/>
       </w:pPr>
       <w:r>
-        <w:t>Step 3 — Send the file securely</w:t>
+        <w:t>Step 2 — Send the file securely</w:t>
       </w:r>
     </w:p>
     <w:p>
       <w:r>
-        <w:rPr>
-          <w:b w:val="0"/>
-          <w:sz w:val="22"/>
-        </w:rPr>
         <w:t>Send the installer to the PC user using a normal company channel:</w:t>
       </w:r>
     </w:p>
@@ -424,7 +353,6 @@
       <w:r>
         <w:rPr>
           <w:b/>
-          <w:sz w:val="22"/>
         </w:rPr>
         <w:t>In the message, include these notes for the user:</w:t>
       </w:r>
@@ -459,15 +387,11 @@
         <w:pStyle w:val="Heading1"/>
       </w:pPr>
       <w:r>
-        <w:t>Step 4 — Confirm they install the right thing</w:t>
+        <w:t>Step 3 — Confirm they install the right thing</w:t>
       </w:r>
     </w:p>
     <w:p>
       <w:r>
-        <w:rPr>
-          <w:b w:val="0"/>
-          <w:sz w:val="22"/>
-        </w:rPr>
         <w:t>After they receive the file, they should:</w:t>
       </w:r>
     </w:p>
@@ -592,7 +516,7 @@
           </w:tcPr>
           <w:p>
             <w:r>
-              <w:t>Company policy / SmartScreen / need IT push via Intune-SCCM</w:t>
+              <w:t>Company policy / SmartScreen</w:t>
             </w:r>
           </w:p>
         </w:tc>
@@ -678,7 +602,7 @@
         <w:pStyle w:val="ListBullet"/>
       </w:pPr>
       <w:r>
-        <w:t>Locate or download Windows Cisco Secure Client / AnyConnect Core VPN MSI</w:t>
+        <w:t>Download Windows Cisco Secure Client / AnyConnect Core VPN MSI (or reuse the previous Windows Cisco installer file)</w:t>
       </w:r>
     </w:p>
     <w:p>
@@ -724,10 +648,6 @@
     <w:p/>
     <w:p>
       <w:r>
-        <w:rPr>
-          <w:b w:val="0"/>
-          <w:sz w:val="22"/>
-        </w:rPr>
         <w:t>That is all that is required on your side for the PC VPN client delivery.</w:t>
       </w:r>
     </w:p>

</xml_diff>